<commit_message>
docs: Update high-resolution enterprise network architecture and DFD diagrams (Hình 2.1 & Hình 2.2) in report and master document
</commit_message>
<xml_diff>
--- a/231A011150_VoQuocThang_46_baocao.docx
+++ b/231A011150_VoQuocThang_46_baocao.docx
@@ -623,191 +623,6 @@
       <w:r>
         <w:br/>
       </w:r>
-    </w:p>
-    <w:p>
-      <w:r>
-        <w:lastRenderedPageBreak/>
-        <w:t>THÔNG TIN VÀ CAM KẾT NỘP BÀI</w:t>
-      </w:r>
-      <w:r>
-        <w:br/>
-        <w:t>• Tên file báo cáo nộp: 231A011150_VoQuocThang_46_BaoCao.docx / .pdf</w:t>
-      </w:r>
-      <w:r>
-        <w:br/>
-        <w:t>• Tên file slide nộp: 231A011150_VoQuocThang_46_Slide.pptx</w:t>
-      </w:r>
-      <w:r>
-        <w:br/>
-        <w:t>• Link Repo GitHub: https://github.com/Hulk1809/IoT-security-policy-for-universities.git</w:t>
-      </w:r>
-      <w:r>
-        <w:br/>
-        <w:t>• AI Usage Disclaimer: This paper has been prepared with the assistance of AI tools Gemini for language editing and grammar checking. The authors are fully responsible for the content and conclusions of the paper.</w:t>
-      </w:r>
-      <w:r>
-        <w:br/>
-        <w:t>• Cam kết an toàn học thuật: Mọi thử nghiệm kiểm thử chỉ diễn ra trong môi trường mô phỏng cục bộ (Local Sandbox). Tuyệt đối không đưa secret/token/mật khẩu thật lên GitHub.</w:t>
-      </w:r>
-    </w:p>
-    <w:p>
-      <w:pPr>
-        <w:spacing w:before="240" w:after="120"/>
-      </w:pPr>
-      <w:r>
-        <w:rPr>
-          <w:b/>
-          <w:color w:val="1E3C72"/>
-          <w:sz w:val="22"/>
-        </w:rPr>
-        <w:t xml:space="preserve">PHIẾU XÁC ĐỊNH YÊU CẦU RIÊNG CỦA ĐỀ TÀI 46 </w:t>
-      </w:r>
-    </w:p>
-    <w:tbl>
-      <w:tblPr>
-        <w:tblW w:w="0" w:type="auto"/>
-        <w:jc w:val="center"/>
-        <w:tblLook w:val="04A0" w:firstRow="1" w:lastRow="0" w:firstColumn="1" w:lastColumn="0" w:noHBand="0" w:noVBand="1"/>
-      </w:tblPr>
-      <w:tblGrid>
-        <w:gridCol w:w="4536"/>
-        <w:gridCol w:w="4536"/>
-      </w:tblGrid>
-      <w:tr>
-        <w:trPr>
-          <w:jc w:val="center"/>
-        </w:trPr>
-        <w:tc>
-          <w:tcPr>
-            <w:tcW w:w="4536" w:type="dxa"/>
-            <w:shd w:val="clear" w:color="auto" w:fill="1E3C72"/>
-          </w:tcPr>
-          <w:p>
-            <w:pPr>
-              <w:jc w:val="center"/>
-            </w:pPr>
-            <w:r>
-              <w:rPr>
-                <w:b/>
-                <w:color w:val="FFFFFF"/>
-                <w:sz w:val="19"/>
-              </w:rPr>
-              <w:t>Mục tiêu cần đạt</w:t>
-            </w:r>
-          </w:p>
-        </w:tc>
-        <w:tc>
-          <w:tcPr>
-            <w:tcW w:w="4536" w:type="dxa"/>
-            <w:shd w:val="clear" w:color="auto" w:fill="1E3C72"/>
-          </w:tcPr>
-          <w:p>
-            <w:pPr>
-              <w:jc w:val="center"/>
-            </w:pPr>
-            <w:r>
-              <w:rPr>
-                <w:b/>
-                <w:color w:val="FFFFFF"/>
-                <w:sz w:val="19"/>
-              </w:rPr>
-              <w:t>Sản phẩm / đầu ra bắt buộc</w:t>
-            </w:r>
-          </w:p>
-        </w:tc>
-      </w:tr>
-      <w:tr>
-        <w:trPr>
-          <w:jc w:val="center"/>
-        </w:trPr>
-        <w:tc>
-          <w:tcPr>
-            <w:tcW w:w="4536" w:type="dxa"/>
-            <w:shd w:val="clear" w:color="auto" w:fill="F8F9FA"/>
-          </w:tcPr>
-          <w:p>
-            <w:r>
-              <w:rPr>
-                <w:sz w:val="19"/>
-              </w:rPr>
-              <w:t>• Xây dựng chính sách bảo mật cho camera, điểm danh, kiểm soát ra vào, cảm biến. (MT-01)</w:t>
-            </w:r>
-            <w:r>
-              <w:rPr>
-                <w:sz w:val="19"/>
-              </w:rPr>
-              <w:br/>
-              <w:t>• Phân loại thiết bị và quyền truy cập trong trường. (MT-02)</w:t>
-            </w:r>
-            <w:r>
-              <w:rPr>
-                <w:sz w:val="19"/>
-              </w:rPr>
-              <w:br/>
-              <w:t>• Đề xuất quy trình vận hành, cập nhật, xử lý sự cố. (MT-03)</w:t>
-            </w:r>
-          </w:p>
-        </w:tc>
-        <w:tc>
-          <w:tcPr>
-            <w:tcW w:w="4536" w:type="dxa"/>
-            <w:shd w:val="clear" w:color="auto" w:fill="F8F9FA"/>
-          </w:tcPr>
-          <w:p>
-            <w:pPr>
-              <w:rPr>
-                <w:lang w:val="de-DE"/>
-              </w:rPr>
-            </w:pPr>
-            <w:r>
-              <w:rPr>
-                <w:sz w:val="19"/>
-                <w:lang w:val="de-DE"/>
-              </w:rPr>
-              <w:t>• Văn bản chính sách 4–6 trang.</w:t>
-            </w:r>
-            <w:r>
-              <w:rPr>
-                <w:sz w:val="19"/>
-                <w:lang w:val="de-DE"/>
-              </w:rPr>
-              <w:br/>
-              <w:t>• Bảng danh mục thiết bị.</w:t>
-            </w:r>
-            <w:r>
-              <w:rPr>
-                <w:sz w:val="19"/>
-                <w:lang w:val="de-DE"/>
-              </w:rPr>
-              <w:br/>
-              <w:t>• Ma trận phân quyền/RACI.</w:t>
-            </w:r>
-            <w:r>
-              <w:rPr>
-                <w:sz w:val="19"/>
-                <w:lang w:val="de-DE"/>
-              </w:rPr>
-              <w:br/>
-              <w:t>• Checklist kiểm tra định kỳ.</w:t>
-            </w:r>
-          </w:p>
-        </w:tc>
-      </w:tr>
-    </w:tbl>
-    <w:p>
-      <w:pPr>
-        <w:tabs>
-          <w:tab w:val="left" w:pos="1335"/>
-        </w:tabs>
-        <w:spacing w:before="120"/>
-        <w:rPr>
-          <w:rFonts w:asciiTheme="majorHAnsi" w:hAnsiTheme="majorHAnsi" w:cstheme="majorHAnsi"/>
-          <w:i/>
-          <w:sz w:val="26"/>
-          <w:szCs w:val="26"/>
-          <w:lang w:val="vi-VN"/>
-        </w:rPr>
-      </w:pPr>
       <w:r>
         <w:rPr>
           <w:rFonts w:asciiTheme="majorHAnsi" w:hAnsiTheme="majorHAnsi" w:cstheme="majorHAnsi"/>
@@ -843,9 +658,10 @@
       </w:pPr>
       <w:r>
         <w:rPr>
-          <w:rFonts w:ascii="Times New Roman" w:hAnsi="Times New Roman"/>
           <w:b/>
-        </w:rPr>
+          <w:lang w:val="vi-VN"/>
+        </w:rPr>
+        <w:lastRenderedPageBreak/>
         <w:t>LỜI CAM ĐOAN</w:t>
       </w:r>
     </w:p>
@@ -859,7 +675,38 @@
         </w:rPr>
       </w:pPr>
       <w:r>
-        <w:t>Em xin cam đoan báo cáo đồ án môn học "Bảo mật IoT" (Mã học phần: 253INT441001) với đề tài "Chính sách Bảo mật IoT cho Trường Đại học" (Đề tài số 46 — Hướng G) là công trình nghiên cứu do chính em thực hiện dưới sự hướng dẫn trực tiếp của giảng viên Thầy Hồ Nhựt Minh.</w:t>
+        <w:rPr>
+          <w:lang w:val="vi-VN"/>
+        </w:rPr>
+        <w:t xml:space="preserve">Em xin cam đoan báo cáo đồ án môn học "Bảo mật </w:t>
+      </w:r>
+      <w:proofErr w:type="spellStart"/>
+      <w:r>
+        <w:rPr>
+          <w:lang w:val="vi-VN"/>
+        </w:rPr>
+        <w:t>IoT</w:t>
+      </w:r>
+      <w:proofErr w:type="spellEnd"/>
+      <w:r>
+        <w:rPr>
+          <w:lang w:val="vi-VN"/>
+        </w:rPr>
+        <w:t xml:space="preserve">" (Mã học phần: 253INT441001) với đề tài "Chính sách Bảo mật </w:t>
+      </w:r>
+      <w:proofErr w:type="spellStart"/>
+      <w:r>
+        <w:rPr>
+          <w:lang w:val="vi-VN"/>
+        </w:rPr>
+        <w:t>IoT</w:t>
+      </w:r>
+      <w:proofErr w:type="spellEnd"/>
+      <w:r>
+        <w:rPr>
+          <w:lang w:val="vi-VN"/>
+        </w:rPr>
+        <w:t xml:space="preserve"> cho Trường Đại học" (là công trình nghiên cứu do chính em thực hiện dưới sự hướng dẫn trực tiếp của giảng viên Thầy Hồ Nhựt Minh.</w:t>
       </w:r>
     </w:p>
     <w:p>
@@ -872,7 +719,52 @@
         </w:rPr>
       </w:pPr>
       <w:r>
-        <w:t>Trong quá trình nghiên cứu và xây dựng báo cáo, em có ứng dụng công cụ Trí tuệ Nhân tạo Google Gemini (Antigravity) làm trợ lý học thuật hỗ trợ tìm kiếm tài liệu tham khảo, rà soát lỗi chính tả, hỗ trợ định dạng cấu trúc tài liệu và gợi ý tối ưu hóa các đoạn mã nguồn mô phỏng.</w:t>
+        <w:rPr>
+          <w:lang w:val="vi-VN"/>
+        </w:rPr>
+        <w:t xml:space="preserve">Trong quá trình nghiên cứu và xây dựng báo cáo, em có ứng dụng công cụ Trí tuệ Nhân tạo </w:t>
+      </w:r>
+      <w:proofErr w:type="spellStart"/>
+      <w:r>
+        <w:rPr>
+          <w:lang w:val="vi-VN"/>
+        </w:rPr>
+        <w:t>Google</w:t>
+      </w:r>
+      <w:proofErr w:type="spellEnd"/>
+      <w:r>
+        <w:rPr>
+          <w:lang w:val="vi-VN"/>
+        </w:rPr>
+        <w:t xml:space="preserve"> </w:t>
+      </w:r>
+      <w:proofErr w:type="spellStart"/>
+      <w:r>
+        <w:rPr>
+          <w:lang w:val="vi-VN"/>
+        </w:rPr>
+        <w:t>Gemini</w:t>
+      </w:r>
+      <w:proofErr w:type="spellEnd"/>
+      <w:r>
+        <w:rPr>
+          <w:lang w:val="vi-VN"/>
+        </w:rPr>
+        <w:t xml:space="preserve"> (</w:t>
+      </w:r>
+      <w:proofErr w:type="spellStart"/>
+      <w:r>
+        <w:rPr>
+          <w:lang w:val="vi-VN"/>
+        </w:rPr>
+        <w:t>Antigravity</w:t>
+      </w:r>
+      <w:proofErr w:type="spellEnd"/>
+      <w:r>
+        <w:rPr>
+          <w:lang w:val="vi-VN"/>
+        </w:rPr>
+        <w:t>) làm trợ lý học thuật hỗ trợ tìm kiếm tài liệu tham khảo, rà soát lỗi chính tả, hỗ trợ định dạng cấu trúc tài liệu và gợi ý tối ưu hóa các đoạn mã nguồn mô phỏng.</w:t>
       </w:r>
     </w:p>
     <w:p>
@@ -885,7 +777,38 @@
         </w:rPr>
       </w:pPr>
       <w:r>
-        <w:t>Em xin khẳng định toàn bộ các kết quả phân tích, ma trận phân loại tài sản IoT, đánh giá rủi ro STRIDE/CVSS v3.1, quy trình vận hành, ma trận RACI, bộ cẩm nang checklist kiểm tra an toàn và các kịch bản kiểm thử mô phỏng được trình bày trong báo cáo đều do em trực tiếp thực hiện, kiểm tra và đối chiếu thực tế.</w:t>
+        <w:rPr>
+          <w:lang w:val="vi-VN"/>
+        </w:rPr>
+        <w:t xml:space="preserve">Em xin khẳng định toàn bộ các kết quả phân tích, ma trận phân loại tài sản </w:t>
+      </w:r>
+      <w:proofErr w:type="spellStart"/>
+      <w:r>
+        <w:rPr>
+          <w:lang w:val="vi-VN"/>
+        </w:rPr>
+        <w:t>IoT</w:t>
+      </w:r>
+      <w:proofErr w:type="spellEnd"/>
+      <w:r>
+        <w:rPr>
+          <w:lang w:val="vi-VN"/>
+        </w:rPr>
+        <w:t xml:space="preserve">, đánh giá rủi ro STRIDE/CVSS v3.1, quy trình vận hành, ma trận RACI, bộ cẩm nang </w:t>
+      </w:r>
+      <w:proofErr w:type="spellStart"/>
+      <w:r>
+        <w:rPr>
+          <w:lang w:val="vi-VN"/>
+        </w:rPr>
+        <w:t>checklist</w:t>
+      </w:r>
+      <w:proofErr w:type="spellEnd"/>
+      <w:r>
+        <w:rPr>
+          <w:lang w:val="vi-VN"/>
+        </w:rPr>
+        <w:t xml:space="preserve"> kiểm tra an toàn và các kịch bản kiểm thử mô phỏng được trình bày trong báo cáo đều do em trực tiếp thực hiện, kiểm tra và đối chiếu thực tế.</w:t>
       </w:r>
     </w:p>
     <w:p>
@@ -898,6 +821,9 @@
         </w:rPr>
       </w:pPr>
       <w:r>
+        <w:rPr>
+          <w:lang w:val="vi-VN"/>
+        </w:rPr>
         <w:t>Em xin hoàn toàn chịu trách nhiệm trước Nhà trường, Khoa Công nghệ Thông tin và Giảng viên hướng dẫn Thầy Hồ Nhựt Minh về tính trung thực, nội dung và các kết luận được trình bày trong đồ án này.</w:t>
       </w:r>
     </w:p>
@@ -5187,20 +5113,45 @@
       <w:pPr>
         <w:rPr>
           <w:rFonts w:asciiTheme="majorHAnsi" w:hAnsiTheme="majorHAnsi" w:cstheme="majorHAnsi"/>
-          <w:sz w:val="24"/>
-          <w:szCs w:val="24"/>
-          <w:lang w:val="vi-VN"/>
-        </w:rPr>
-      </w:pPr>
-      <w:r>
-        <w:rPr>
-          <w:rFonts w:asciiTheme="majorHAnsi" w:hAnsiTheme="majorHAnsi" w:cstheme="majorHAnsi"/>
           <w:i/>
           <w:iCs/>
           <w:sz w:val="24"/>
           <w:szCs w:val="24"/>
           <w:lang w:val="vi-VN"/>
         </w:rPr>
+      </w:pPr>
+    </w:p>
+    <w:p>
+      <w:pPr>
+        <w:rPr>
+          <w:rFonts w:asciiTheme="majorHAnsi" w:hAnsiTheme="majorHAnsi" w:cstheme="majorHAnsi"/>
+          <w:i/>
+          <w:iCs/>
+          <w:sz w:val="24"/>
+          <w:szCs w:val="24"/>
+          <w:lang w:val="vi-VN"/>
+        </w:rPr>
+      </w:pPr>
+    </w:p>
+    <w:p>
+      <w:pPr>
+        <w:rPr>
+          <w:rFonts w:asciiTheme="majorHAnsi" w:hAnsiTheme="majorHAnsi" w:cstheme="majorHAnsi"/>
+          <w:sz w:val="24"/>
+          <w:szCs w:val="24"/>
+          <w:lang w:val="vi-VN"/>
+        </w:rPr>
+      </w:pPr>
+      <w:r>
+        <w:rPr>
+          <w:rFonts w:asciiTheme="majorHAnsi" w:hAnsiTheme="majorHAnsi" w:cstheme="majorHAnsi"/>
+          <w:i/>
+          <w:iCs/>
+          <w:sz w:val="24"/>
+          <w:szCs w:val="24"/>
+          <w:lang w:val="vi-VN"/>
+        </w:rPr>
+        <w:lastRenderedPageBreak/>
         <w:t>Bảng đối chiếu mục tiêu và đầu ra của đề tài:</w:t>
       </w:r>
     </w:p>
@@ -5222,7 +5173,6 @@
           <w:szCs w:val="24"/>
           <w:lang w:val="vi-VN"/>
         </w:rPr>
-        <w:lastRenderedPageBreak/>
         <w:t xml:space="preserve">BẢNG ĐỐI CHIẾU MỤC TIÊU VÀ SẢN PHẨM ĐẦU RA TƯƠNG ỨNG </w:t>
       </w:r>
     </w:p>
@@ -9179,6 +9129,46 @@
     </w:p>
     <w:p>
       <w:pPr>
+        <w:spacing w:before="240" w:after="120"/>
+        <w:jc w:val="center"/>
+      </w:pPr>
+      <w:r>
+        <w:drawing>
+          <wp:inline xmlns:a="http://schemas.openxmlformats.org/drawingml/2006/main" xmlns:pic="http://schemas.openxmlformats.org/drawingml/2006/picture">
+            <wp:extent cx="5669280" cy="3164249"/>
+            <wp:docPr id="1925196923" name="Picture 1925196923"/>
+            <wp:cNvGraphicFramePr>
+              <a:graphicFrameLocks noChangeAspect="1"/>
+            </wp:cNvGraphicFramePr>
+            <a:graphic>
+              <a:graphicData uri="http://schemas.openxmlformats.org/drawingml/2006/picture">
+                <pic:pic>
+                  <pic:nvPicPr>
+                    <pic:cNvPr id="0" name="diagram_vlan_architecture.jpg"/>
+                    <pic:cNvPicPr/>
+                  </pic:nvPicPr>
+                  <pic:blipFill>
+                    <a:blip r:embed="rId33"/>
+                    <a:stretch>
+                      <a:fillRect/>
+                    </a:stretch>
+                  </pic:blipFill>
+                  <pic:spPr>
+                    <a:xfrm>
+                      <a:off x="0" y="0"/>
+                      <a:ext cx="5669280" cy="3164249"/>
+                    </a:xfrm>
+                    <a:prstGeom prst="rect"/>
+                  </pic:spPr>
+                </pic:pic>
+              </a:graphicData>
+            </a:graphic>
+          </wp:inline>
+        </w:drawing>
+      </w:r>
+    </w:p>
+    <w:p>
+      <w:pPr>
         <w:rPr>
           <w:rFonts w:asciiTheme="majorHAnsi" w:hAnsiTheme="majorHAnsi" w:cstheme="majorHAnsi"/>
           <w:i/>
@@ -9267,6 +9257,46 @@
                     <a:prstGeom prst="rect">
                       <a:avLst/>
                     </a:prstGeom>
+                  </pic:spPr>
+                </pic:pic>
+              </a:graphicData>
+            </a:graphic>
+          </wp:inline>
+        </w:drawing>
+      </w:r>
+    </w:p>
+    <w:p>
+      <w:pPr>
+        <w:spacing w:before="240" w:after="120"/>
+        <w:jc w:val="center"/>
+      </w:pPr>
+      <w:r>
+        <w:drawing>
+          <wp:inline xmlns:a="http://schemas.openxmlformats.org/drawingml/2006/main" xmlns:pic="http://schemas.openxmlformats.org/drawingml/2006/picture">
+            <wp:extent cx="5669280" cy="3164249"/>
+            <wp:docPr id="1925196924" name="Picture 1925196924"/>
+            <wp:cNvGraphicFramePr>
+              <a:graphicFrameLocks noChangeAspect="1"/>
+            </wp:cNvGraphicFramePr>
+            <a:graphic>
+              <a:graphicData uri="http://schemas.openxmlformats.org/drawingml/2006/picture">
+                <pic:pic>
+                  <pic:nvPicPr>
+                    <pic:cNvPr id="0" name="diagram_dfd_trust_boundaries.jpg"/>
+                    <pic:cNvPicPr/>
+                  </pic:nvPicPr>
+                  <pic:blipFill>
+                    <a:blip r:embed="rId34"/>
+                    <a:stretch>
+                      <a:fillRect/>
+                    </a:stretch>
+                  </pic:blipFill>
+                  <pic:spPr>
+                    <a:xfrm>
+                      <a:off x="0" y="0"/>
+                      <a:ext cx="5669280" cy="3164249"/>
+                    </a:xfrm>
+                    <a:prstGeom prst="rect"/>
                   </pic:spPr>
                 </pic:pic>
               </a:graphicData>

</xml_diff>